<commit_message>
Compact Note_Taker_Briefing: 15 -> 11 pages by consolidating page breaks.
Content unchanged. Restructured 13 ====-wrapped sections (each forcing a page break) into 6 major sections with all-caps Heading 2 subsections inside. Quick Reference Card retains its own page for tear-off use. Saves 4 pages (~27%) of print volume per copy.

Co-Authored-By: Claude Opus 4.7 (1M context) <noreply@anthropic.com>
</commit_message>
<xml_diff>
--- a/Focus Group Materials/Day-of Operations/Note_Taker_Briefing.docx
+++ b/Focus Group Materials/Day-of Operations/Note_Taker_Briefing.docx
@@ -60,40 +60,33 @@
         <w:pStyle w:val="Heading1"/>
       </w:pPr>
       <w:r>
-        <w:t>WELCOME, AND THANK YOU</w:t>
+        <w:t>YOUR ROLE AND YOUR DAY</w:t>
+      </w:r>
+    </w:p>
+    <w:p>
+      <w:pPr>
+        <w:pStyle w:val="Heading2"/>
+      </w:pPr>
+      <w:r>
+        <w:t>WHY THIS ROLE MATTERS</w:t>
       </w:r>
     </w:p>
     <w:p>
       <w:r>
-        <w:t>Note-takers are the most important under-celebrated role in the room.</w:t>
+        <w:t>Note-takers are the most important under-celebrated role in the room. The audio recording will catch every word. The worksheets will capture each attendee's private written answers. But neither captures the read of the room. Who deferred to whom. Who visibly disagreed but did not say anything. When the room agreed without saying so. When somebody pushed back politely on a question that should be reopened. That is what you capture, and there is no other way to get it.</w:t>
       </w:r>
     </w:p>
     <w:p>
       <w:r>
-        <w:t>The audio recording will catch every word. The worksheets will capture each attendee's private written answers. But neither of those captures the read of the room. Who deferred to whom. Who visibly disagreed but did not say anything. When the room agreed without saying so. When somebody pushed back politely on a question that should be reopened.</w:t>
+        <w:t>You signed an NDA. You are a trusted observer. You are not asked to be a researcher or a transcriptionist. You are asked to read the room with attention and write down what you notice in a simple shorthand we will teach you.</w:t>
       </w:r>
     </w:p>
     <w:p>
+      <w:pPr>
+        <w:pStyle w:val="Heading2"/>
+      </w:pPr>
       <w:r>
-        <w:t>That is what you capture, and there is no other way to get it.</w:t>
-      </w:r>
-    </w:p>
-    <w:p>
-      <w:r>
-        <w:t>You signed an NDA. You are a trusted observer. You are not asked to be a researcher or a transcriptionist. You are asked to read the room with attention and write down what you notice in a simple shorthand we will teach you in this document.</w:t>
-      </w:r>
-    </w:p>
-    <w:p>
-      <w:r>
-        <w:br w:type="page"/>
-      </w:r>
-    </w:p>
-    <w:p>
-      <w:pPr>
-        <w:pStyle w:val="Heading1"/>
-      </w:pPr>
-      <w:r>
-        <w:t>YOUR ROLE IN ONE PARAGRAPH</w:t>
+        <w:t>YOUR JOB IN ONE PARAGRAPH</w:t>
       </w:r>
     </w:p>
     <w:p>
@@ -102,13 +95,8 @@
       </w:r>
     </w:p>
     <w:p>
-      <w:r>
-        <w:br w:type="page"/>
-      </w:r>
-    </w:p>
-    <w:p>
-      <w:pPr>
-        <w:pStyle w:val="Heading1"/>
+      <w:pPr>
+        <w:pStyle w:val="Heading2"/>
       </w:pPr>
       <w:r>
         <w:t>THE FULL DAY AT A GLANCE</w:t>
@@ -145,9 +133,7 @@
         </w:rPr>
         <w:t xml:space="preserve">  12:00 - 12:15  Welcome block (Arron). Sit and listen.</w:t>
         <w:br/>
-        <w:t xml:space="preserve">                 Verbal recording confirmation happens</w:t>
-        <w:br/>
-        <w:t xml:space="preserve">                 here.</w:t>
+        <w:t xml:space="preserve">                 Verbal recording confirmation happens here.</w:t>
       </w:r>
     </w:p>
     <w:p>
@@ -164,9 +150,9 @@
         <w:br/>
         <w:t xml:space="preserve">                 The athlete stories you hear (Athlete A,</w:t>
         <w:br/>
-        <w:t xml:space="preserve">                 B, C) are the anonymized versions of</w:t>
+        <w:t xml:space="preserve">                 B, C) are the anonymized versions of what</w:t>
         <w:br/>
-        <w:t xml:space="preserve">                 what is in the artifact packets.</w:t>
+        <w:t xml:space="preserve">                 is in the artifact packets.</w:t>
       </w:r>
     </w:p>
     <w:p>
@@ -181,9 +167,9 @@
         </w:rPr>
         <w:t xml:space="preserve">  12:45 - 1:15   Mockup walkthrough (Arron). Sit and</w:t>
         <w:br/>
-        <w:t xml:space="preserve">                 listen. Useful context for what the</w:t>
+        <w:t xml:space="preserve">                 listen. Useful context for what attendees</w:t>
         <w:br/>
-        <w:t xml:space="preserve">                 attendees will be reacting to.</w:t>
+        <w:t xml:space="preserve">                 will be reacting to.</w:t>
       </w:r>
     </w:p>
     <w:p>
@@ -219,7 +205,7 @@
         </w:rPr>
         <w:t xml:space="preserve">  1:30 - 2:15    YOUR BREAKOUT BLOCK. This is when you</w:t>
         <w:br/>
-        <w:t xml:space="preserve">                 do your actual job. See sections below.</w:t>
+        <w:t xml:space="preserve">                 do your actual job.</w:t>
       </w:r>
     </w:p>
     <w:p>
@@ -236,9 +222,9 @@
         <w:br/>
         <w:t xml:space="preserve">                 the full-room discussion as a participant.</w:t>
         <w:br/>
-        <w:t xml:space="preserve">                 You do NOT note-take this block.</w:t>
+        <w:t xml:space="preserve">                 You do NOT note-take this block. The</w:t>
         <w:br/>
-        <w:t xml:space="preserve">                 The audio recording covers it.</w:t>
+        <w:t xml:space="preserve">                 audio recording covers it.</w:t>
       </w:r>
     </w:p>
     <w:p>
@@ -299,11 +285,16 @@
     </w:p>
     <w:p>
       <w:pPr>
-        <w:spacing w:before="0" w:after="120"/>
-        <w:pBdr>
-          <w:bottom w:val="single" w:sz="6" w:space="1" w:color="808080"/>
-        </w:pBdr>
-      </w:pPr>
+        <w:pStyle w:val="Heading2"/>
+      </w:pPr>
+      <w:r>
+        <w:t>INSTITUTIONAL  (6 ATTENDEES)  ARRON FACILITATES</w:t>
+      </w:r>
+    </w:p>
+    <w:p>
+      <w:r>
+        <w:t>This is the most complex breakout. It uses a SOFT-SPLIT structure where high school coaches answer each question first, then college coaches answer with a possible reframe. You tag every note with an HS or COL tier prefix to keep the answers separable at synthesis time.</w:t>
+      </w:r>
     </w:p>
     <w:p>
       <w:pPr>
@@ -315,16 +306,42 @@
           <w:rFonts w:ascii="Consolas" w:hAnsi="Consolas"/>
           <w:sz w:val="18"/>
         </w:rPr>
-        <w:t xml:space="preserve">  INSTITUTIONAL  (6 attendees)  Arron facilitates</w:t>
+        <w:t xml:space="preserve">  Rick Klimchock      HS      RK</w:t>
+        <w:br/>
+        <w:t xml:space="preserve">  Gio Vonne Sanders   HS      GS</w:t>
+        <w:br/>
+        <w:t xml:space="preserve">  Buck Larry          HS      BL</w:t>
+        <w:br/>
+        <w:t xml:space="preserve">  Bret Colbert        COL     BR</w:t>
+        <w:br/>
+        <w:t xml:space="preserve">  Bob Colbert         COL     BO</w:t>
+        <w:br/>
+        <w:t xml:space="preserve">  Chris Russell       COL     CR</w:t>
       </w:r>
     </w:p>
     <w:p>
-      <w:pPr>
-        <w:spacing w:before="0" w:after="120"/>
-        <w:pBdr>
-          <w:bottom w:val="single" w:sz="6" w:space="1" w:color="808080"/>
-        </w:pBdr>
-      </w:pPr>
+      <w:r>
+        <w:rPr>
+          <w:b/>
+        </w:rPr>
+        <w:t xml:space="preserve">Note on initials: </w:t>
+      </w:r>
+      <w:r>
+        <w:t>Bret and Bob are both Colberts. We use first-name initials BR and BO to avoid the BC / BC collision.</w:t>
+      </w:r>
+    </w:p>
+    <w:p>
+      <w:pPr>
+        <w:pStyle w:val="Heading2"/>
+      </w:pPr>
+      <w:r>
+        <w:t>D2C / ATHLETE  (4 ATTENDEES)  NICOLE FACILITATES</w:t>
+      </w:r>
+    </w:p>
+    <w:p>
+      <w:r>
+        <w:t>Standard breakout structure. No tier prefix. You tag notes with attendee initials only.</w:t>
+      </w:r>
     </w:p>
     <w:p>
       <w:pPr>
@@ -336,15 +353,26 @@
           <w:rFonts w:ascii="Consolas" w:hAnsi="Consolas"/>
           <w:sz w:val="18"/>
         </w:rPr>
-        <w:t xml:space="preserve">  This is the most complex breakout. It uses a SOFT-SPLIT</w:t>
+        <w:t xml:space="preserve">  Ron Oswald          RO</w:t>
         <w:br/>
-        <w:t xml:space="preserve">  structure where high school coaches answer each question</w:t>
+        <w:t xml:space="preserve">  Liz Marcheleovich   LM</w:t>
         <w:br/>
-        <w:t xml:space="preserve">  first, then college coaches answer with a possible</w:t>
+        <w:t xml:space="preserve">  Alex Bohince        AB</w:t>
         <w:br/>
-        <w:t xml:space="preserve">  reframe. You tag every note with an HS or COL tier</w:t>
-        <w:br/>
-        <w:t xml:space="preserve">  prefix to keep the answers separable at synthesis time.</w:t>
+        <w:t xml:space="preserve">  Tamara Mahady       TM</w:t>
+      </w:r>
+    </w:p>
+    <w:p>
+      <w:pPr>
+        <w:pStyle w:val="Heading2"/>
+      </w:pPr>
+      <w:r>
+        <w:t>GTM  (4 ATTENDEES)  FACILITATOR TBD</w:t>
+      </w:r>
+    </w:p>
+    <w:p>
+      <w:r>
+        <w:t>Standard breakout structure. No tier prefix. You tag notes with attendee initials only.</w:t>
       </w:r>
     </w:p>
     <w:p>
@@ -357,166 +385,13 @@
           <w:rFonts w:ascii="Consolas" w:hAnsi="Consolas"/>
           <w:sz w:val="18"/>
         </w:rPr>
-        <w:t xml:space="preserve">  Attendees:</w:t>
+        <w:t xml:space="preserve">  Jon Reese           JR</w:t>
         <w:br/>
-        <w:t xml:space="preserve">    Rick Klimchock      HS      RK</w:t>
+        <w:t xml:space="preserve">  Noele Creamer       NC</w:t>
         <w:br/>
-        <w:t xml:space="preserve">    Gio Vonne Sanders   HS      GS</w:t>
+        <w:t xml:space="preserve">  Jennifer Altimore   JA</w:t>
         <w:br/>
-        <w:t xml:space="preserve">    Buck Larry          HS      BL</w:t>
-        <w:br/>
-        <w:t xml:space="preserve">    Bret Colbert        COL     BR</w:t>
-        <w:br/>
-        <w:t xml:space="preserve">    Bob Colbert         COL     BO</w:t>
-        <w:br/>
-        <w:t xml:space="preserve">    Chris Russell       COL     CR</w:t>
-      </w:r>
-    </w:p>
-    <w:p>
-      <w:pPr>
-        <w:spacing w:before="0" w:after="0" w:line="240" w:lineRule="auto"/>
-        <w:ind w:left="288"/>
-      </w:pPr>
-      <w:r>
-        <w:rPr>
-          <w:rFonts w:ascii="Consolas" w:hAnsi="Consolas"/>
-          <w:sz w:val="18"/>
-        </w:rPr>
-        <w:t xml:space="preserve">  Note on initials: Bret and Bob are both Colberts.</w:t>
-        <w:br/>
-        <w:t xml:space="preserve">  We use first-name initials BR and BO to avoid the</w:t>
-        <w:br/>
-        <w:t xml:space="preserve">  BC / BC collision.</w:t>
-      </w:r>
-    </w:p>
-    <w:p>
-      <w:pPr>
-        <w:spacing w:before="0" w:after="120"/>
-        <w:pBdr>
-          <w:bottom w:val="single" w:sz="6" w:space="1" w:color="808080"/>
-        </w:pBdr>
-      </w:pPr>
-    </w:p>
-    <w:p>
-      <w:pPr>
-        <w:spacing w:before="0" w:after="0" w:line="240" w:lineRule="auto"/>
-        <w:ind w:left="288"/>
-      </w:pPr>
-      <w:r>
-        <w:rPr>
-          <w:rFonts w:ascii="Consolas" w:hAnsi="Consolas"/>
-          <w:sz w:val="18"/>
-        </w:rPr>
-        <w:t xml:space="preserve">  D2C / ATHLETE  (4 attendees)  Nicole facilitates</w:t>
-      </w:r>
-    </w:p>
-    <w:p>
-      <w:pPr>
-        <w:spacing w:before="0" w:after="120"/>
-        <w:pBdr>
-          <w:bottom w:val="single" w:sz="6" w:space="1" w:color="808080"/>
-        </w:pBdr>
-      </w:pPr>
-    </w:p>
-    <w:p>
-      <w:pPr>
-        <w:spacing w:before="0" w:after="0" w:line="240" w:lineRule="auto"/>
-        <w:ind w:left="288"/>
-      </w:pPr>
-      <w:r>
-        <w:rPr>
-          <w:rFonts w:ascii="Consolas" w:hAnsi="Consolas"/>
-          <w:sz w:val="18"/>
-        </w:rPr>
-        <w:t xml:space="preserve">  Standard breakout structure. No tier prefix. You tag</w:t>
-        <w:br/>
-        <w:t xml:space="preserve">  notes with attendee initials only.</w:t>
-      </w:r>
-    </w:p>
-    <w:p>
-      <w:pPr>
-        <w:spacing w:before="0" w:after="0" w:line="240" w:lineRule="auto"/>
-        <w:ind w:left="288"/>
-      </w:pPr>
-      <w:r>
-        <w:rPr>
-          <w:rFonts w:ascii="Consolas" w:hAnsi="Consolas"/>
-          <w:sz w:val="18"/>
-        </w:rPr>
-        <w:t xml:space="preserve">  Attendees:</w:t>
-        <w:br/>
-        <w:t xml:space="preserve">    Ron Oswald          RO</w:t>
-        <w:br/>
-        <w:t xml:space="preserve">    Liz Marcheleovich   LM</w:t>
-        <w:br/>
-        <w:t xml:space="preserve">    Alex Bohince        AB</w:t>
-        <w:br/>
-        <w:t xml:space="preserve">    Tamara Mahady       TM</w:t>
-      </w:r>
-    </w:p>
-    <w:p>
-      <w:pPr>
-        <w:spacing w:before="0" w:after="120"/>
-        <w:pBdr>
-          <w:bottom w:val="single" w:sz="6" w:space="1" w:color="808080"/>
-        </w:pBdr>
-      </w:pPr>
-    </w:p>
-    <w:p>
-      <w:pPr>
-        <w:spacing w:before="0" w:after="0" w:line="240" w:lineRule="auto"/>
-        <w:ind w:left="288"/>
-      </w:pPr>
-      <w:r>
-        <w:rPr>
-          <w:rFonts w:ascii="Consolas" w:hAnsi="Consolas"/>
-          <w:sz w:val="18"/>
-        </w:rPr>
-        <w:t xml:space="preserve">  GTM  (4 attendees)  Facilitator TBD</w:t>
-      </w:r>
-    </w:p>
-    <w:p>
-      <w:pPr>
-        <w:spacing w:before="0" w:after="120"/>
-        <w:pBdr>
-          <w:bottom w:val="single" w:sz="6" w:space="1" w:color="808080"/>
-        </w:pBdr>
-      </w:pPr>
-    </w:p>
-    <w:p>
-      <w:pPr>
-        <w:spacing w:before="0" w:after="0" w:line="240" w:lineRule="auto"/>
-        <w:ind w:left="288"/>
-      </w:pPr>
-      <w:r>
-        <w:rPr>
-          <w:rFonts w:ascii="Consolas" w:hAnsi="Consolas"/>
-          <w:sz w:val="18"/>
-        </w:rPr>
-        <w:t xml:space="preserve">  Standard breakout structure. No tier prefix. You tag</w:t>
-        <w:br/>
-        <w:t xml:space="preserve">  notes with attendee initials only.</w:t>
-      </w:r>
-    </w:p>
-    <w:p>
-      <w:pPr>
-        <w:spacing w:before="0" w:after="0" w:line="240" w:lineRule="auto"/>
-        <w:ind w:left="288"/>
-      </w:pPr>
-      <w:r>
-        <w:rPr>
-          <w:rFonts w:ascii="Consolas" w:hAnsi="Consolas"/>
-          <w:sz w:val="18"/>
-        </w:rPr>
-        <w:t xml:space="preserve">  Attendees:</w:t>
-        <w:br/>
-        <w:t xml:space="preserve">    Jon Reese           JR</w:t>
-        <w:br/>
-        <w:t xml:space="preserve">    Noele Creamer       NC</w:t>
-        <w:br/>
-        <w:t xml:space="preserve">    Jennifer Altimore   JA</w:t>
-        <w:br/>
-        <w:t xml:space="preserve">    Tom Panigall        TP</w:t>
+        <w:t xml:space="preserve">  Tom Panigall        TP</w:t>
       </w:r>
     </w:p>
     <w:p>
@@ -551,74 +426,21 @@
       </w:r>
     </w:p>
     <w:p>
-      <w:pPr>
-        <w:pStyle w:val="Heading2"/>
-      </w:pPr>
       <w:r>
-        <w:t>TIME</w:t>
+        <w:t>Aim for a timestamp at the start of every meaningful entry. Helps synthesis align your notes with the audio transcript.</w:t>
       </w:r>
     </w:p>
     <w:p>
       <w:pPr>
-        <w:spacing w:before="0" w:after="0" w:line="240" w:lineRule="auto"/>
-        <w:ind w:left="288"/>
+        <w:pStyle w:val="Heading2"/>
       </w:pPr>
       <w:r>
-        <w:rPr>
-          <w:rFonts w:ascii="Consolas" w:hAnsi="Consolas"/>
-          <w:sz w:val="18"/>
-        </w:rPr>
-        <w:t xml:space="preserve">  Hour and minute, e.g., 1:42. Aim for a timestamp at</w:t>
-        <w:br/>
-        <w:t xml:space="preserve">  the start of every meaningful entry. Helps synthesis</w:t>
-        <w:br/>
-        <w:t xml:space="preserve">  align your notes with the audio transcript.</w:t>
+        <w:t>SENTIMENT CODES</w:t>
       </w:r>
     </w:p>
     <w:p>
       <w:r>
-        <w:t>TIER  (Institutional only; D2C and GTM leave this blank)</w:t>
-      </w:r>
-    </w:p>
-    <w:p>
-      <w:pPr>
-        <w:spacing w:before="0" w:after="0" w:line="240" w:lineRule="auto"/>
-        <w:ind w:left="288"/>
-      </w:pPr>
-      <w:r>
-        <w:rPr>
-          <w:rFonts w:ascii="Consolas" w:hAnsi="Consolas"/>
-          <w:sz w:val="18"/>
-        </w:rPr>
-        <w:t xml:space="preserve">  HS   = High school coach is answering</w:t>
-        <w:br/>
-        <w:t xml:space="preserve">  COL  = College coach is answering</w:t>
-      </w:r>
-    </w:p>
-    <w:p>
-      <w:pPr>
-        <w:pStyle w:val="Heading2"/>
-      </w:pPr>
-      <w:r>
-        <w:t>INITIALS</w:t>
-      </w:r>
-    </w:p>
-    <w:p>
-      <w:pPr>
-        <w:spacing w:before="0" w:after="0" w:line="240" w:lineRule="auto"/>
-        <w:ind w:left="288"/>
-      </w:pPr>
-      <w:r>
-        <w:rPr>
-          <w:rFonts w:ascii="Consolas" w:hAnsi="Consolas"/>
-          <w:sz w:val="18"/>
-        </w:rPr>
-        <w:t xml:space="preserve">  Two letters, see your segment's attendee table above.</w:t>
-      </w:r>
-    </w:p>
-    <w:p>
-      <w:r>
-        <w:t>CODE  (single letter; the most important part)</w:t>
+        <w:t>Single letter, the most important part of every entry.</w:t>
       </w:r>
     </w:p>
     <w:p>
@@ -667,7 +489,35 @@
         <w:pStyle w:val="Heading2"/>
       </w:pPr>
       <w:r>
-        <w:t>CONTENT</w:t>
+        <w:t>TIER PREFIX  (INSTITUTIONAL ONLY)</w:t>
+      </w:r>
+    </w:p>
+    <w:p>
+      <w:r>
+        <w:t>D2C and GTM note-takers leave this blank.</w:t>
+      </w:r>
+    </w:p>
+    <w:p>
+      <w:pPr>
+        <w:spacing w:before="0" w:after="0" w:line="240" w:lineRule="auto"/>
+        <w:ind w:left="288"/>
+      </w:pPr>
+      <w:r>
+        <w:rPr>
+          <w:rFonts w:ascii="Consolas" w:hAnsi="Consolas"/>
+          <w:sz w:val="18"/>
+        </w:rPr>
+        <w:t xml:space="preserve">  HS   = High school coach is answering (Rick, Gio, Buck)</w:t>
+        <w:br/>
+        <w:t xml:space="preserve">  COL  = College coach is answering (Bret, Bob, Chris)</w:t>
+      </w:r>
+    </w:p>
+    <w:p>
+      <w:pPr>
+        <w:pStyle w:val="Heading2"/>
+      </w:pPr>
+      <w:r>
+        <w:t>VERBATIM RULES</w:t>
       </w:r>
     </w:p>
     <w:p>
@@ -761,21 +611,11 @@
       </w:r>
     </w:p>
     <w:p>
+      <w:pPr>
+        <w:pStyle w:val="Heading2"/>
+      </w:pPr>
       <w:r>
-        <w:br w:type="page"/>
-      </w:r>
-    </w:p>
-    <w:p>
-      <w:pPr>
-        <w:pStyle w:val="Heading1"/>
-      </w:pPr>
-      <w:r>
-        <w:t>EXAMPLES OF GOOD ENTRIES</w:t>
-      </w:r>
-    </w:p>
-    <w:p>
-      <w:r>
-        <w:t>INSTITUTIONAL (note tier prefix):</w:t>
+        <w:t>EXAMPLES (INSTITUTIONAL — NOTE TIER PREFIX)</w:t>
       </w:r>
     </w:p>
     <w:p>
@@ -883,8 +723,11 @@
       </w:r>
     </w:p>
     <w:p>
+      <w:pPr>
+        <w:pStyle w:val="Heading2"/>
+      </w:pPr>
       <w:r>
-        <w:t>D2C and GTM (no tier prefix):</w:t>
+        <w:t>EXAMPLES (D2C AND GTM — NO TIER PREFIX)</w:t>
       </w:r>
     </w:p>
     <w:p>
@@ -929,7 +772,7 @@
         <w:pStyle w:val="Heading1"/>
       </w:pPr>
       <w:r>
-        <w:t>WHAT YOU LISTEN FOR (CROSS-LENS FLAGS)</w:t>
+        <w:t>WHAT TO LISTEN FOR (CROSS-LENS FLAGS)</w:t>
       </w:r>
     </w:p>
     <w:p>
@@ -942,7 +785,7 @@
         <w:pStyle w:val="Heading2"/>
       </w:pPr>
       <w:r>
-        <w:t>INSTITUTIONAL:</w:t>
+        <w:t>INSTITUTIONAL</w:t>
       </w:r>
     </w:p>
     <w:p>
@@ -976,13 +819,11 @@
         <w:br/>
         <w:t xml:space="preserve">    (football and wrestling), current HS wrestling head</w:t>
         <w:br/>
-        <w:t xml:space="preserve">    coach. Lens to watch for: NCAA Transfer Portal</w:t>
+        <w:t xml:space="preserve">    coach. Watch for: NCAA Transfer Portal recruitment-</w:t>
         <w:br/>
-        <w:t xml:space="preserve">    recruitment-pipeline experience firsthand, dual-</w:t>
+        <w:t xml:space="preserve">    pipeline experience firsthand, dual-sport skill-</w:t>
         <w:br/>
-        <w:t xml:space="preserve">    sport skill-transfer perspective, faith-based</w:t>
-        <w:br/>
-        <w:t xml:space="preserve">    mentorship framing.</w:t>
+        <w:t xml:space="preserve">    transfer perspective, faith-based mentorship framing.</w:t>
       </w:r>
     </w:p>
     <w:p>
@@ -999,17 +840,15 @@
         <w:br/>
         <w:t xml:space="preserve">    with 2009 state championship experience. Currently</w:t>
         <w:br/>
-        <w:t xml:space="preserve">    works UNDER his son as head coach. Lens to watch</w:t>
+        <w:t xml:space="preserve">    works UNDER his son as head coach. Watch for: father-</w:t>
         <w:br/>
-        <w:t xml:space="preserve">    for: father-son coaching dynamic (parent-layer</w:t>
+        <w:t xml:space="preserve">    son coaching dynamic (parent-layer perspective from</w:t>
         <w:br/>
-        <w:t xml:space="preserve">    perspective from a coach seat); old-school plus</w:t>
+        <w:t xml:space="preserve">    a coach seat); old-school plus modern chemistry blend</w:t>
         <w:br/>
-        <w:t xml:space="preserve">    modern chemistry blend (tests whether VirtusFocus</w:t>
+        <w:t xml:space="preserve">    (tests whether VirtusFocus reads as modern enough for</w:t>
         <w:br/>
-        <w:t xml:space="preserve">    reads as modern enough for younger coaches AND</w:t>
-        <w:br/>
-        <w:t xml:space="preserve">    rigorous enough for veterans).</w:t>
+        <w:t xml:space="preserve">    younger coaches AND rigorous enough for veterans).</w:t>
       </w:r>
     </w:p>
     <w:p>
@@ -1024,9 +863,9 @@
         </w:rPr>
         <w:t xml:space="preserve">  Bret Colbert — Collegiate WR coach with offensive-</w:t>
         <w:br/>
-        <w:t xml:space="preserve">    coordinator experience. Lens to watch for:</w:t>
+        <w:t xml:space="preserve">    coordinator experience. Watch for: institutional</w:t>
         <w:br/>
-        <w:t xml:space="preserve">    institutional coaching-staff adoption dynamics.</w:t>
+        <w:t xml:space="preserve">    coaching-staff adoption dynamics.</w:t>
       </w:r>
     </w:p>
     <w:p>
@@ -1041,11 +880,9 @@
         </w:rPr>
         <w:t xml:space="preserve">  Bob Colbert — NFL veteran defensive assistant plus</w:t>
         <w:br/>
-        <w:t xml:space="preserve">    Saint Vincent program-builder. Lens to watch for:</w:t>
+        <w:t xml:space="preserve">    Saint Vincent program-builder. Watch for: AD-level</w:t>
         <w:br/>
-        <w:t xml:space="preserve">    AD-level adoption strategy; rebuilding-from-zero</w:t>
-        <w:br/>
-        <w:t xml:space="preserve">    perspective.</w:t>
+        <w:t xml:space="preserve">    adoption strategy; rebuilding-from-zero perspective.</w:t>
       </w:r>
     </w:p>
     <w:p>
@@ -1060,23 +897,21 @@
         </w:rPr>
         <w:t xml:space="preserve">  Chris Russell — Offensive Line Coach plus Video</w:t>
         <w:br/>
-        <w:t xml:space="preserve">    Coordinator at Seton Hill. Returning from FBS</w:t>
+        <w:t xml:space="preserve">    Coordinator at Seton Hill. Returning from FBS Power</w:t>
         <w:br/>
-        <w:t xml:space="preserve">    Power Four (Pitt under Narduzzi). Engineering</w:t>
+        <w:t xml:space="preserve">    Four (Pitt under Narduzzi). Engineering education</w:t>
         <w:br/>
-        <w:t xml:space="preserve">    education background. Lens to watch for: FBS-vs-</w:t>
+        <w:t xml:space="preserve">    background. Watch for: FBS-vs-D2 contrast (relevant</w:t>
         <w:br/>
-        <w:t xml:space="preserve">    D2 contrast (relevant to white-label vs single-app</w:t>
+        <w:t xml:space="preserve">    to white-label vs single-app architecture);</w:t>
         <w:br/>
-        <w:t xml:space="preserve">    architecture); analytical-coaching specialty</w:t>
+        <w:t xml:space="preserve">    analytical-coaching specialty (closest match in the</w:t>
         <w:br/>
-        <w:t xml:space="preserve">    (closest match in the room to the Coach Insights</w:t>
+        <w:t xml:space="preserve">    room to the Coach Insights dashboard's target user);</w:t>
         <w:br/>
-        <w:t xml:space="preserve">    dashboard's target user); engineering-education</w:t>
+        <w:t xml:space="preserve">    engineering-education technical-mindset (demands</w:t>
         <w:br/>
-        <w:t xml:space="preserve">    technical-mindset (demands system rigor and data</w:t>
-        <w:br/>
-        <w:t xml:space="preserve">    integrity).</w:t>
+        <w:t xml:space="preserve">    system rigor and data integrity).</w:t>
       </w:r>
     </w:p>
     <w:p>
@@ -1084,7 +919,7 @@
         <w:pStyle w:val="Heading2"/>
       </w:pPr>
       <w:r>
-        <w:t>D2C / ATHLETE:</w:t>
+        <w:t>D2C / ATHLETE</w:t>
       </w:r>
     </w:p>
     <w:p>
@@ -1099,9 +934,9 @@
         </w:rPr>
         <w:t xml:space="preserve">  Ron Oswald — 4x Academic All-American wrestler plus</w:t>
         <w:br/>
-        <w:t xml:space="preserve">    Swampfox wrestling club founder. Lens to watch for:</w:t>
+        <w:t xml:space="preserve">    Swampfox wrestling club founder. Watch for: youth-</w:t>
         <w:br/>
-        <w:t xml:space="preserve">    youth-program operator perspective.</w:t>
+        <w:t xml:space="preserve">    program operator perspective.</w:t>
       </w:r>
     </w:p>
     <w:p>
@@ -1118,9 +953,9 @@
         <w:br/>
         <w:t xml:space="preserve">    PowerKidz / Tots / Sproutz strength programs at</w:t>
         <w:br/>
-        <w:t xml:space="preserve">    Virtus Barbell. Lens to watch for: youth-coaching</w:t>
+        <w:t xml:space="preserve">    Virtus Barbell. Watch for: youth-coaching operator</w:t>
         <w:br/>
-        <w:t xml:space="preserve">    operator perspective.</w:t>
+        <w:t xml:space="preserve">    perspective.</w:t>
       </w:r>
     </w:p>
     <w:p>
@@ -1135,9 +970,7 @@
         </w:rPr>
         <w:t xml:space="preserve">  Alex Bohince — Father of two, husband of co-founder</w:t>
         <w:br/>
-        <w:t xml:space="preserve">    Nicole. Lens to watch for: parent perspective from</w:t>
-        <w:br/>
-        <w:t xml:space="preserve">    a D2C seat.</w:t>
+        <w:t xml:space="preserve">    Nicole. Watch for: parent perspective from a D2C seat.</w:t>
       </w:r>
     </w:p>
     <w:p>
@@ -1152,19 +985,14 @@
         </w:rPr>
         <w:t xml:space="preserve">  Tamara Mahady — Magisterial District Judge plus</w:t>
         <w:br/>
-        <w:t xml:space="preserve">    former collegiate softball player. Lens to watch</w:t>
+        <w:t xml:space="preserve">    former collegiate softball player. Watch for: legal-</w:t>
         <w:br/>
-        <w:t xml:space="preserve">    for: legal-system framing on compliance and</w:t>
-        <w:br/>
-        <w:t xml:space="preserve">    privacy issues.</w:t>
+        <w:t xml:space="preserve">    system framing on compliance and privacy issues.</w:t>
       </w:r>
     </w:p>
     <w:p>
-      <w:pPr>
-        <w:pStyle w:val="Heading2"/>
-      </w:pPr>
       <w:r>
-        <w:t>GTM:</w:t>
+        <w:t>GTM</w:t>
       </w:r>
     </w:p>
     <w:p>
@@ -1177,9 +1005,9 @@
           <w:rFonts w:ascii="Consolas" w:hAnsi="Consolas"/>
           <w:sz w:val="18"/>
         </w:rPr>
-        <w:t xml:space="preserve">  Jon Reese — President of Sales at Overly Door,</w:t>
+        <w:t xml:space="preserve">  Jon Reese — President of Sales at Overly Door, GCDC</w:t>
         <w:br/>
-        <w:t xml:space="preserve">    GCDC President, civic leader.</w:t>
+        <w:t xml:space="preserve">    President, civic leader.</w:t>
       </w:r>
     </w:p>
     <w:p>
@@ -1192,13 +1020,11 @@
           <w:rFonts w:ascii="Consolas" w:hAnsi="Consolas"/>
           <w:sz w:val="18"/>
         </w:rPr>
-        <w:t xml:space="preserve">  Noele Creamer — Pittsburgh writer with PR / exec</w:t>
+        <w:t xml:space="preserve">  Noele Creamer — Pittsburgh writer with PR / exec comms</w:t>
         <w:br/>
-        <w:t xml:space="preserve">    comms / freelance background. Parent of collegiate</w:t>
+        <w:t xml:space="preserve">    / freelance background. Parent of collegiate athletes.</w:t>
         <w:br/>
-        <w:t xml:space="preserve">    athletes. Lens to watch for: D2C parent perspective</w:t>
-        <w:br/>
-        <w:t xml:space="preserve">    in a GTM seat.</w:t>
+        <w:t xml:space="preserve">    Watch for: D2C parent perspective in a GTM seat.</w:t>
       </w:r>
     </w:p>
     <w:p>
@@ -1215,13 +1041,13 @@
         <w:br/>
         <w:t xml:space="preserve">    Hypnotherapist plus marketing leader plus best-</w:t>
         <w:br/>
-        <w:t xml:space="preserve">    selling author. Lens to watch for: competitive-</w:t>
+        <w:t xml:space="preserve">    selling author. Watch for: competitive-space-adjacent</w:t>
         <w:br/>
-        <w:t xml:space="preserve">    space-adjacent expertise (hypnotherapy is mental-</w:t>
+        <w:t xml:space="preserve">    expertise (hypnotherapy is mental-performance</w:t>
         <w:br/>
-        <w:t xml:space="preserve">    performance adjacency); her category-and-</w:t>
+        <w:t xml:space="preserve">    adjacency); her category-and-competition response</w:t>
         <w:br/>
-        <w:t xml:space="preserve">    competition response will be uniquely sharp.</w:t>
+        <w:t xml:space="preserve">    will be uniquely sharp.</w:t>
       </w:r>
     </w:p>
     <w:p>
@@ -1234,13 +1060,13 @@
           <w:rFonts w:ascii="Consolas" w:hAnsi="Consolas"/>
           <w:sz w:val="18"/>
         </w:rPr>
-        <w:t xml:space="preserve">  Tom Panigall — 20-year senior leadership at Pepsi</w:t>
+        <w:t xml:space="preserve">  Tom Panigall — 20-year senior leadership at Pepsi and</w:t>
         <w:br/>
-        <w:t xml:space="preserve">    and Red Bull plus Brooklyn Healthy. Lens to watch</w:t>
+        <w:t xml:space="preserve">    Red Bull plus Brooklyn Healthy. Watch for: consumer-</w:t>
         <w:br/>
-        <w:t xml:space="preserve">    for: consumer-brand-marketing strategic depth at</w:t>
+        <w:t xml:space="preserve">    brand-marketing strategic depth at company sizes</w:t>
         <w:br/>
-        <w:t xml:space="preserve">    company sizes both above and below ours.</w:t>
+        <w:t xml:space="preserve">    both above and below ours.</w:t>
       </w:r>
     </w:p>
     <w:p>
@@ -1253,6 +1079,14 @@
         <w:pStyle w:val="Heading1"/>
       </w:pPr>
       <w:r>
+        <w:t>DURING AND AFTER THE BREAKOUT</w:t>
+      </w:r>
+    </w:p>
+    <w:p>
+      <w:pPr>
+        <w:pStyle w:val="Heading2"/>
+      </w:pPr>
+      <w:r>
         <w:t>WHAT TO CAPTURE</w:t>
       </w:r>
     </w:p>
@@ -1266,13 +1100,11 @@
           <w:rFonts w:ascii="Consolas" w:hAnsi="Consolas"/>
           <w:sz w:val="18"/>
         </w:rPr>
-        <w:t xml:space="preserve">  Verbatim quotes when something quotable lands.</w:t>
+        <w:t xml:space="preserve">  Verbatim quotes when something quotable lands. Examples</w:t>
         <w:br/>
-        <w:t xml:space="preserve">    Examples of quotable: a sharp turn of phrase, a</w:t>
+        <w:t xml:space="preserve">    of quotable: a sharp turn of phrase, a pointed</w:t>
         <w:br/>
-        <w:t xml:space="preserve">    pointed criticism, a vivid analogy, a reframe of</w:t>
-        <w:br/>
-        <w:t xml:space="preserve">    the question.</w:t>
+        <w:t xml:space="preserve">    criticism, a vivid analogy, a reframe of the question.</w:t>
       </w:r>
     </w:p>
     <w:p>
@@ -1285,11 +1117,25 @@
           <w:rFonts w:ascii="Consolas" w:hAnsi="Consolas"/>
           <w:sz w:val="18"/>
         </w:rPr>
-        <w:t xml:space="preserve">  Sentiment shifts. When the energy in the group</w:t>
+        <w:t xml:space="preserve">  Sentiment shifts. When the energy in the group pivots,</w:t>
         <w:br/>
-        <w:t xml:space="preserve">    pivots, write it down: Room agreed without saying</w:t>
-        <w:br/>
-        <w:t xml:space="preserve">    so. Or: Quiet pause after Tom's pushback.</w:t>
+        <w:t xml:space="preserve">    write it down: "Room agreed without saying so." Or:</w:t>
+      </w:r>
+    </w:p>
+    <w:p>
+      <w:pPr>
+        <w:spacing w:before="80" w:after="80"/>
+        <w:ind w:left="576"/>
+        <w:pBdr>
+          <w:left w:val="single" w:sz="12" w:space="8" w:color="1F3A60"/>
+        </w:pBdr>
+      </w:pPr>
+      <w:r>
+        <w:rPr>
+          <w:i w:val="0"/>
+          <w:sz w:val="22"/>
+        </w:rPr>
+        <w:t>"Quiet pause after Tom's pushback."</w:t>
       </w:r>
     </w:p>
     <w:p>
@@ -1304,9 +1150,9 @@
         </w:rPr>
         <w:t xml:space="preserve">  Cross-lens moments (asterisk code). When somebody</w:t>
         <w:br/>
-        <w:t xml:space="preserve">    brings their secondary perspective. These are</w:t>
+        <w:t xml:space="preserve">    brings their secondary perspective. These are the</w:t>
         <w:br/>
-        <w:t xml:space="preserve">    the highest-value entries because the audio plus</w:t>
+        <w:t xml:space="preserve">    highest-value entries because the audio plus</w:t>
         <w:br/>
         <w:t xml:space="preserve">    transcript may not flag them automatically.</w:t>
       </w:r>
@@ -1323,9 +1169,9 @@
         </w:rPr>
         <w:t xml:space="preserve">  Disagreements that go unsaid. When one attendee</w:t>
         <w:br/>
-        <w:t xml:space="preserve">    visibly reacts to another but does not speak.</w:t>
+        <w:t xml:space="preserve">    visibly reacts to another but does not speak. Audio</w:t>
         <w:br/>
-        <w:t xml:space="preserve">    Audio cannot catch that. You can.</w:t>
+        <w:t xml:space="preserve">    cannot catch that. You can.</w:t>
       </w:r>
     </w:p>
     <w:p>
@@ -1346,13 +1192,8 @@
       </w:r>
     </w:p>
     <w:p>
-      <w:r>
-        <w:br w:type="page"/>
-      </w:r>
-    </w:p>
-    <w:p>
-      <w:pPr>
-        <w:pStyle w:val="Heading1"/>
+      <w:pPr>
+        <w:pStyle w:val="Heading2"/>
       </w:pPr>
       <w:r>
         <w:t>WHAT NOT TO CAPTURE (AND WHY)</w:t>
@@ -1391,11 +1232,11 @@
           <w:rFonts w:ascii="Consolas" w:hAnsi="Consolas"/>
           <w:sz w:val="18"/>
         </w:rPr>
-        <w:t xml:space="preserve">  Do NOT summarize in real time. Capture moments,</w:t>
+        <w:t xml:space="preserve">  Do NOT summarize in real time. Capture moments, not</w:t>
         <w:br/>
-        <w:t xml:space="preserve">    not summaries. Synthesis builds the summary from</w:t>
+        <w:t xml:space="preserve">    summaries. Synthesis builds the summary from your</w:t>
         <w:br/>
-        <w:t xml:space="preserve">    your moments plus the transcript.</w:t>
+        <w:t xml:space="preserve">    moments plus the transcript.</w:t>
       </w:r>
     </w:p>
     <w:p>
@@ -1410,11 +1251,11 @@
         </w:rPr>
         <w:t xml:space="preserve">  Do NOT editorialize in your notes. "I think Tom is</w:t>
         <w:br/>
-        <w:t xml:space="preserve">    right" has no place in your notebook. Your job is</w:t>
+        <w:t xml:space="preserve">    right" has no place in your notebook. Your job is to</w:t>
         <w:br/>
-        <w:t xml:space="preserve">    to capture what they said and how they said it,</w:t>
+        <w:t xml:space="preserve">    capture what they said and how they said it, not</w:t>
         <w:br/>
-        <w:t xml:space="preserve">    not what you thought of it.</w:t>
+        <w:t xml:space="preserve">    what you thought of it.</w:t>
       </w:r>
     </w:p>
     <w:p>
@@ -1446,11 +1287,11 @@
           <w:rFonts w:ascii="Consolas" w:hAnsi="Consolas"/>
           <w:sz w:val="18"/>
         </w:rPr>
-        <w:t xml:space="preserve">  Do NOT make eye contact with attendees in a way</w:t>
+        <w:t xml:space="preserve">  Do NOT make eye contact with attendees in a way that</w:t>
         <w:br/>
-        <w:t xml:space="preserve">    that invites being addressed. Sit slightly off</w:t>
+        <w:t xml:space="preserve">    invites being addressed. Sit slightly off to the</w:t>
         <w:br/>
-        <w:t xml:space="preserve">    to the side, neutral expression.</w:t>
+        <w:t xml:space="preserve">    side, neutral expression.</w:t>
       </w:r>
     </w:p>
     <w:p>
@@ -1463,30 +1304,23 @@
           <w:rFonts w:ascii="Consolas" w:hAnsi="Consolas"/>
           <w:sz w:val="18"/>
         </w:rPr>
-        <w:t xml:space="preserve">  Do NOT use real names of athletes if they come up</w:t>
+        <w:t xml:space="preserve">  Do NOT use real names of athletes if they come up in</w:t>
         <w:br/>
-        <w:t xml:space="preserve">    in discussion. Athletes are anonymized as</w:t>
+        <w:t xml:space="preserve">    discussion. Athletes are anonymized as Athlete A,</w:t>
         <w:br/>
-        <w:t xml:space="preserve">    Athlete A, Athlete B, Athlete C in all materials.</w:t>
+        <w:t xml:space="preserve">    Athlete B, Athlete C in all materials. If an</w:t>
         <w:br/>
-        <w:t xml:space="preserve">    If an attendee guesses or names a real athlete,</w:t>
+        <w:t xml:space="preserve">    attendee guesses or names a real athlete, capture</w:t>
         <w:br/>
-        <w:t xml:space="preserve">    capture that they did so but do not reproduce</w:t>
-        <w:br/>
-        <w:t xml:space="preserve">    the name in your notes.</w:t>
+        <w:t xml:space="preserve">    that they did so but do not reproduce the name.</w:t>
       </w:r>
     </w:p>
     <w:p>
+      <w:pPr>
+        <w:pStyle w:val="Heading2"/>
+      </w:pPr>
       <w:r>
-        <w:br w:type="page"/>
-      </w:r>
-    </w:p>
-    <w:p>
-      <w:pPr>
-        <w:pStyle w:val="Heading1"/>
-      </w:pPr>
-      <w:r>
-        <w:t>WORKSHEET COLLECTION (END OF YOUR BREAKOUT)</w:t>
+        <w:t>WORKSHEET COLLECTION (AT 2:15)</w:t>
       </w:r>
     </w:p>
     <w:p>
@@ -1512,7 +1346,7 @@
         <w:pStyle w:val="ListNumber"/>
       </w:pPr>
       <w:r>
-        <w:t>Place all worksheets in your labeled segment</w:t>
+        <w:t>Place all worksheets in your labeled segment folder</w:t>
       </w:r>
     </w:p>
     <w:p>
@@ -1525,7 +1359,7 @@
           <w:rFonts w:ascii="Consolas" w:hAnsi="Consolas"/>
           <w:sz w:val="18"/>
         </w:rPr>
-        <w:t xml:space="preserve">     folder (Institutional / D2C / GTM).</w:t>
+        <w:t xml:space="preserve">     (Institutional / D2C / GTM).</w:t>
       </w:r>
     </w:p>
     <w:p>
@@ -1533,7 +1367,7 @@
         <w:pStyle w:val="ListNumber"/>
       </w:pPr>
       <w:r>
-        <w:t>NAME field on the cover is OPTIONAL. Do not</w:t>
+        <w:t>NAME field on the cover is OPTIONAL. Do not pressure</w:t>
       </w:r>
     </w:p>
     <w:p>
@@ -1546,7 +1380,7 @@
           <w:rFonts w:ascii="Consolas" w:hAnsi="Consolas"/>
           <w:sz w:val="18"/>
         </w:rPr>
-        <w:t xml:space="preserve">     pressure anyone who left it blank.</w:t>
+        <w:t xml:space="preserve">     anyone who left it blank.</w:t>
       </w:r>
     </w:p>
     <w:p>
@@ -1579,13 +1413,8 @@
       </w:r>
     </w:p>
     <w:p>
-      <w:r>
-        <w:br w:type="page"/>
-      </w:r>
-    </w:p>
-    <w:p>
-      <w:pPr>
-        <w:pStyle w:val="Heading1"/>
+      <w:pPr>
+        <w:pStyle w:val="Heading2"/>
       </w:pPr>
       <w:r>
         <w:t>COMPLIANCE REMINDERS</w:t>
@@ -1601,9 +1430,9 @@
           <w:rFonts w:ascii="Consolas" w:hAnsi="Consolas"/>
           <w:sz w:val="18"/>
         </w:rPr>
-        <w:t xml:space="preserve">  You signed an NDA. Everything in the room stays in</w:t>
+        <w:t xml:space="preserve">  You signed an NDA. Everything in the room stays in the</w:t>
         <w:br/>
-        <w:t xml:space="preserve">    the room until Arron or Nicole say otherwise.</w:t>
+        <w:t xml:space="preserve">    room until Arron or Nicole say otherwise.</w:t>
       </w:r>
     </w:p>
     <w:p>
@@ -1631,9 +1460,9 @@
           <w:rFonts w:ascii="Consolas" w:hAnsi="Consolas"/>
           <w:sz w:val="18"/>
         </w:rPr>
-        <w:t xml:space="preserve">  Do not name real athletes in your notes. Use</w:t>
+        <w:t xml:space="preserve">  Do not name real athletes in your notes. Use Athlete</w:t>
         <w:br/>
-        <w:t xml:space="preserve">    Athlete A / B / C if context is needed.</w:t>
+        <w:t xml:space="preserve">    A / B / C if context is needed.</w:t>
       </w:r>
     </w:p>
     <w:p>
@@ -1646,9 +1475,9 @@
           <w:rFonts w:ascii="Consolas" w:hAnsi="Consolas"/>
           <w:sz w:val="18"/>
         </w:rPr>
-        <w:t xml:space="preserve">  Do not discuss attendee identities or quotes</w:t>
+        <w:t xml:space="preserve">  Do not discuss attendee identities or quotes outside</w:t>
         <w:br/>
-        <w:t xml:space="preserve">    outside the synthesis team.</w:t>
+        <w:t xml:space="preserve">    the synthesis team.</w:t>
       </w:r>
     </w:p>
     <w:p>
@@ -1661,29 +1490,19 @@
           <w:rFonts w:ascii="Consolas" w:hAnsi="Consolas"/>
           <w:sz w:val="18"/>
         </w:rPr>
-        <w:t xml:space="preserve">  Audio recordings, your notes, and the worksheets</w:t>
+        <w:t xml:space="preserve">  Audio recordings, your notes, and the worksheets are</w:t>
         <w:br/>
-        <w:t xml:space="preserve">    are all confidential. Treat the folder you carry</w:t>
+        <w:t xml:space="preserve">    all confidential. Treat the folder you carry around</w:t>
         <w:br/>
-        <w:t xml:space="preserve">    around as sensitive material.</w:t>
+        <w:t xml:space="preserve">    as sensitive material.</w:t>
       </w:r>
     </w:p>
     <w:p>
+      <w:pPr>
+        <w:pStyle w:val="Heading2"/>
+      </w:pPr>
       <w:r>
-        <w:br w:type="page"/>
-      </w:r>
-    </w:p>
-    <w:p>
-      <w:pPr>
-        <w:pStyle w:val="Heading1"/>
-      </w:pPr>
-      <w:r>
-        <w:t>PRE-EVENT CHECKLIST</w:t>
-      </w:r>
-    </w:p>
-    <w:p>
-      <w:r>
-        <w:t>By May 8 (the day before):</w:t>
+        <w:t>PRE-EVENT CHECKLIST (BY MAY 8)</w:t>
       </w:r>
     </w:p>
     <w:p>
@@ -1698,9 +1517,7 @@
         </w:rPr>
         <w:t xml:space="preserve">  [ ] You have read this document end to end</w:t>
         <w:br/>
-        <w:t xml:space="preserve">  [ ] You know which breakout segment you are</w:t>
-        <w:br/>
-        <w:t xml:space="preserve">      assigned to</w:t>
+        <w:t xml:space="preserve">  [ ] You know which breakout segment you are assigned to</w:t>
         <w:br/>
         <w:t xml:space="preserve">  [ ] You know the attendee initials for your segment</w:t>
         <w:br/>

</xml_diff>